<commit_message>
feat(update): sync 2026-09-01 workout (12.04km run, 79 rTSS), update W36 execution report and deploy 52-week dashboard to GitHub Pages
</commit_message>
<xml_diff>
--- a/docs/weekly/2026-W36_當週執行率回顧報告.docx
+++ b/docs/weekly/2026-W36_當週執行率回顧報告.docx
@@ -21,7 +21,7 @@
           <w:color w:val="555555"/>
           <w:sz w:val="20"/>
         </w:rPr>
-        <w:t>週期：2026/08/31–2026/09/06　｜　整體時間執行率：0.0%</w:t>
+        <w:t>週期：2026/08/31–2026/09/06　｜　整體時間執行率：11.3%</w:t>
       </w:r>
     </w:p>
     <w:p>
@@ -783,7 +783,7 @@
                 <w:color w:val="000000"/>
                 <w:sz w:val="19"/>
               </w:rPr>
-              <w:t>0.00 hr</w:t>
+              <w:t>1.65 hr</w:t>
             </w:r>
           </w:p>
         </w:tc>
@@ -810,7 +810,7 @@
                 <w:color w:val="000000"/>
                 <w:sz w:val="19"/>
               </w:rPr>
-              <w:t>0.0%</w:t>
+              <w:t>36.0%</w:t>
             </w:r>
           </w:p>
         </w:tc>
@@ -864,7 +864,7 @@
                 <w:color w:val="000000"/>
                 <w:sz w:val="19"/>
               </w:rPr>
-              <w:t>0.00 km</w:t>
+              <w:t>12.04 km</w:t>
             </w:r>
           </w:p>
         </w:tc>
@@ -891,7 +891,7 @@
                 <w:color w:val="000000"/>
                 <w:sz w:val="19"/>
               </w:rPr>
-              <w:t>0.0%</w:t>
+              <w:t>20.6%</w:t>
             </w:r>
           </w:p>
         </w:tc>
@@ -1963,7 +1963,7 @@
                 <w:color w:val="000000"/>
                 <w:sz w:val="19"/>
               </w:rPr>
-              <w:t>0分</w:t>
+              <w:t>99分 / 12.04km</w:t>
             </w:r>
           </w:p>
         </w:tc>
@@ -1990,7 +1990,7 @@
                 <w:color w:val="000000"/>
                 <w:sz w:val="19"/>
               </w:rPr>
-              <w:t>❌ 未執行/待排程</w:t>
+              <w:t>⚡ 超額完成 (116%, A)</w:t>
             </w:r>
           </w:p>
         </w:tc>
@@ -3345,11 +3345,15 @@
     </w:p>
     <w:p>
       <w:r>
-        <w:t>• 當週累積自行車 0.00 km、跑步 0.00 km、游泳 0.00 km，整體時間執行率達 0.0%。</w:t>
+        <w:t>• 當週累積自行車 0.00 km、跑步 12.04 km、游泳 0.00 km，整體時間執行率達 11.3%。</w:t>
         <w:br/>
       </w:r>
       <w:r>
-        <w:t>• 在高負荷訓練後無縫銜接轉換跑，並依據即時心率與體感自覺彈性調整，兼顧神經肌肉適應與傷害防範。</w:t>
+        <w:t>• Build 1-1 第一建構期旗開得勝：本週正式邁入專項建構期，週二跑步課表扎實吃下 12.04 km (99 分鐘)，單日累積 79 rTSS，專項速度與耐力建構起步極佳！</w:t>
+        <w:br/>
+      </w:r>
+      <w:r>
+        <w:t>• 週二 12.04km 跑步間歇與專項耐力高質量完成：9/1 跑步包含 6 組 400m 速度間歇（配速 3:57~4:09/km、均瓦 369-398W、步頻 183-190 spm、垂直比 6-7% 頂尖經濟性）與接續節奏跑，均心率 147 bpm，脫鉤率 (-9.25% Pw:HR / -6.87% Spd:HR) 展現極佳的心肺穩定度與下肢抗疲勞剛性。</w:t>
         <w:br/>
       </w:r>
     </w:p>

</xml_diff>

<commit_message>
Auto Daily 8:00 PM Dashboard Update [2026-09-01 20:00]
</commit_message>
<xml_diff>
--- a/docs/weekly/2026-W36_當週執行率回顧報告.docx
+++ b/docs/weekly/2026-W36_當週執行率回顧報告.docx
@@ -21,7 +21,7 @@
           <w:color w:val="555555"/>
           <w:sz w:val="20"/>
         </w:rPr>
-        <w:t>週期：2026/08/31–2026/09/06　｜　整體時間執行率：11.3%</w:t>
+        <w:t>週期：2026/08/31–2026/09/06　｜　整體時間執行率：16.1%</w:t>
       </w:r>
     </w:p>
     <w:p>
@@ -538,7 +538,7 @@
                 <w:color w:val="000000"/>
                 <w:sz w:val="19"/>
               </w:rPr>
-              <w:t>6.00 hr</w:t>
+              <w:t>5.25 hr</w:t>
             </w:r>
           </w:p>
         </w:tc>
@@ -565,7 +565,7 @@
                 <w:color w:val="000000"/>
                 <w:sz w:val="19"/>
               </w:rPr>
-              <w:t>0.00 hr</w:t>
+              <w:t>0.58 hr</w:t>
             </w:r>
           </w:p>
         </w:tc>
@@ -592,7 +592,7 @@
                 <w:color w:val="000000"/>
                 <w:sz w:val="19"/>
               </w:rPr>
-              <w:t>0.0%</w:t>
+              <w:t>11.1%</w:t>
             </w:r>
           </w:p>
         </w:tc>
@@ -646,7 +646,7 @@
                 <w:color w:val="000000"/>
                 <w:sz w:val="19"/>
               </w:rPr>
-              <w:t>0.00 km</w:t>
+              <w:t>17.32 km</w:t>
             </w:r>
           </w:p>
         </w:tc>
@@ -700,7 +700,7 @@
                 <w:color w:val="000000"/>
                 <w:sz w:val="19"/>
               </w:rPr>
-              <w:t>4</w:t>
+              <w:t>3</w:t>
             </w:r>
           </w:p>
         </w:tc>
@@ -1550,172 +1550,6 @@
                 <w:color w:val="000000"/>
                 <w:sz w:val="19"/>
               </w:rPr>
-              <w:t>Bike: TEMPO 80</w:t>
-            </w:r>
-          </w:p>
-        </w:tc>
-        <w:tc>
-          <w:tcPr>
-            <w:tcW w:type="dxa" w:w="1050"/>
-            <w:tcMar>
-              <w:top w:w="80" w:type="dxa"/>
-              <w:start w:w="120" w:type="dxa"/>
-              <w:bottom w:w="80" w:type="dxa"/>
-              <w:end w:w="120" w:type="dxa"/>
-            </w:tcMar>
-            <w:vAlign w:val="center"/>
-          </w:tcPr>
-          <w:p>
-            <w:pPr>
-              <w:spacing w:after="0"/>
-              <w:jc w:val="center"/>
-            </w:pPr>
-            <w:r>
-              <w:rPr>
-                <w:rFonts w:ascii="Calibri" w:hAnsi="Calibri" w:eastAsia="Microsoft JhengHei"/>
-                <w:b w:val="0"/>
-                <w:color w:val="000000"/>
-                <w:sz w:val="19"/>
-              </w:rPr>
-              <w:t>Bike</w:t>
-            </w:r>
-          </w:p>
-        </w:tc>
-        <w:tc>
-          <w:tcPr>
-            <w:tcW w:type="dxa" w:w="1500"/>
-            <w:tcMar>
-              <w:top w:w="80" w:type="dxa"/>
-              <w:start w:w="120" w:type="dxa"/>
-              <w:bottom w:w="80" w:type="dxa"/>
-              <w:end w:w="120" w:type="dxa"/>
-            </w:tcMar>
-            <w:vAlign w:val="center"/>
-          </w:tcPr>
-          <w:p>
-            <w:pPr>
-              <w:spacing w:after="0"/>
-              <w:jc w:val="center"/>
-            </w:pPr>
-            <w:r>
-              <w:rPr>
-                <w:rFonts w:ascii="Calibri" w:hAnsi="Calibri" w:eastAsia="Microsoft JhengHei"/>
-                <w:b w:val="0"/>
-                <w:color w:val="000000"/>
-                <w:sz w:val="19"/>
-              </w:rPr>
-              <w:t>45分</w:t>
-            </w:r>
-          </w:p>
-        </w:tc>
-        <w:tc>
-          <w:tcPr>
-            <w:tcW w:type="dxa" w:w="1500"/>
-            <w:tcMar>
-              <w:top w:w="80" w:type="dxa"/>
-              <w:start w:w="120" w:type="dxa"/>
-              <w:bottom w:w="80" w:type="dxa"/>
-              <w:end w:w="120" w:type="dxa"/>
-            </w:tcMar>
-            <w:vAlign w:val="center"/>
-          </w:tcPr>
-          <w:p>
-            <w:pPr>
-              <w:spacing w:after="0"/>
-              <w:jc w:val="center"/>
-            </w:pPr>
-            <w:r>
-              <w:rPr>
-                <w:rFonts w:ascii="Calibri" w:hAnsi="Calibri" w:eastAsia="Microsoft JhengHei"/>
-                <w:b w:val="0"/>
-                <w:color w:val="000000"/>
-                <w:sz w:val="19"/>
-              </w:rPr>
-              <w:t>0分</w:t>
-            </w:r>
-          </w:p>
-        </w:tc>
-        <w:tc>
-          <w:tcPr>
-            <w:tcW w:type="dxa" w:w="1810"/>
-            <w:tcMar>
-              <w:top w:w="80" w:type="dxa"/>
-              <w:start w:w="120" w:type="dxa"/>
-              <w:bottom w:w="80" w:type="dxa"/>
-              <w:end w:w="120" w:type="dxa"/>
-            </w:tcMar>
-            <w:vAlign w:val="center"/>
-          </w:tcPr>
-          <w:p>
-            <w:pPr>
-              <w:spacing w:after="0"/>
-              <w:jc w:val="center"/>
-            </w:pPr>
-            <w:r>
-              <w:rPr>
-                <w:rFonts w:ascii="Calibri" w:hAnsi="Calibri" w:eastAsia="Microsoft JhengHei"/>
-                <w:b w:val="0"/>
-                <w:color w:val="000000"/>
-                <w:sz w:val="19"/>
-              </w:rPr>
-              <w:t>❌ 未執行/待排程</w:t>
-            </w:r>
-          </w:p>
-        </w:tc>
-      </w:tr>
-      <w:tr>
-        <w:tc>
-          <w:tcPr>
-            <w:tcW w:type="dxa" w:w="1050"/>
-            <w:tcMar>
-              <w:top w:w="80" w:type="dxa"/>
-              <w:start w:w="120" w:type="dxa"/>
-              <w:bottom w:w="80" w:type="dxa"/>
-              <w:end w:w="120" w:type="dxa"/>
-            </w:tcMar>
-            <w:vAlign w:val="center"/>
-          </w:tcPr>
-          <w:p>
-            <w:pPr>
-              <w:spacing w:after="0"/>
-              <w:jc w:val="center"/>
-            </w:pPr>
-            <w:r>
-              <w:rPr>
-                <w:rFonts w:ascii="Calibri" w:hAnsi="Calibri" w:eastAsia="Microsoft JhengHei"/>
-                <w:b w:val="0"/>
-                <w:color w:val="000000"/>
-                <w:sz w:val="19"/>
-              </w:rPr>
-              <w:t>09/01</w:t>
-              <w:br/>
-              <w:t>週二</w:t>
-            </w:r>
-          </w:p>
-        </w:tc>
-        <w:tc>
-          <w:tcPr>
-            <w:tcW w:type="dxa" w:w="2750"/>
-            <w:tcMar>
-              <w:top w:w="80" w:type="dxa"/>
-              <w:start w:w="120" w:type="dxa"/>
-              <w:bottom w:w="80" w:type="dxa"/>
-              <w:end w:w="120" w:type="dxa"/>
-            </w:tcMar>
-            <w:vAlign w:val="center"/>
-          </w:tcPr>
-          <w:p>
-            <w:pPr>
-              <w:spacing w:after="0"/>
-              <w:jc w:val="left"/>
-            </w:pPr>
-            <w:r>
-              <w:rPr>
-                <w:rFonts w:ascii="Calibri" w:hAnsi="Calibri" w:eastAsia="Microsoft JhengHei"/>
-                <w:b w:val="0"/>
-                <w:color w:val="000000"/>
-                <w:sz w:val="19"/>
-              </w:rPr>
               <w:t>Bike: TEMPO 8X3</w:t>
             </w:r>
           </w:p>
@@ -1797,7 +1631,7 @@
                 <w:color w:val="000000"/>
                 <w:sz w:val="19"/>
               </w:rPr>
-              <w:t>0分</w:t>
+              <w:t>35分 / 17.32km</w:t>
             </w:r>
           </w:p>
         </w:tc>
@@ -1824,7 +1658,7 @@
                 <w:color w:val="000000"/>
                 <w:sz w:val="19"/>
               </w:rPr>
-              <w:t>❌ 未執行/待排程</w:t>
+              <w:t>🟢 良好達標 (78%, A-)</w:t>
             </w:r>
           </w:p>
         </w:tc>
@@ -3345,7 +3179,7 @@
     </w:p>
     <w:p>
       <w:r>
-        <w:t>• 當週累積自行車 0.00 km、跑步 12.04 km、游泳 0.00 km，整體時間執行率達 11.3%。</w:t>
+        <w:t>• 當週累積自行車 17.32 km、跑步 12.04 km、游泳 0.00 km，整體時間執行率達 16.1%。</w:t>
         <w:br/>
       </w:r>
       <w:r>

</xml_diff>

<commit_message>
sync: update 2026-09-02 swim workout (3.45km) and refresh W36 dashboard & recovery analytics
</commit_message>
<xml_diff>
--- a/docs/weekly/2026-W36_當週執行率回顧報告.docx
+++ b/docs/weekly/2026-W36_當週執行率回顧報告.docx
@@ -21,7 +21,7 @@
           <w:color w:val="555555"/>
           <w:sz w:val="20"/>
         </w:rPr>
-        <w:t>週期：2026/08/31–2026/09/06　｜　整體時間執行率：16.1%</w:t>
+        <w:t>週期：2026/08/31–2026/09/06　｜　整體時間執行率：24.6%</w:t>
       </w:r>
     </w:p>
     <w:p>
@@ -347,7 +347,7 @@
                 <w:color w:val="000000"/>
                 <w:sz w:val="19"/>
               </w:rPr>
-              <w:t>0.00 hr</w:t>
+              <w:t>1.17 hr</w:t>
             </w:r>
           </w:p>
         </w:tc>
@@ -374,7 +374,7 @@
                 <w:color w:val="000000"/>
                 <w:sz w:val="19"/>
               </w:rPr>
-              <w:t>0.0%</w:t>
+              <w:t>29.2%</w:t>
             </w:r>
           </w:p>
         </w:tc>
@@ -428,7 +428,7 @@
                 <w:color w:val="000000"/>
                 <w:sz w:val="19"/>
               </w:rPr>
-              <w:t>0.00 km</w:t>
+              <w:t>3.45 km</w:t>
             </w:r>
           </w:p>
         </w:tc>
@@ -455,7 +455,7 @@
                 <w:color w:val="000000"/>
                 <w:sz w:val="19"/>
               </w:rPr>
-              <w:t>0.0%</w:t>
+              <w:t>115.0%</w:t>
             </w:r>
           </w:p>
         </w:tc>
@@ -1963,7 +1963,7 @@
                 <w:color w:val="000000"/>
                 <w:sz w:val="19"/>
               </w:rPr>
-              <w:t>0分</w:t>
+              <w:t>70分 / 3.45km</w:t>
             </w:r>
           </w:p>
         </w:tc>
@@ -1990,7 +1990,7 @@
                 <w:color w:val="000000"/>
                 <w:sz w:val="19"/>
               </w:rPr>
-              <w:t>❌ 未執行/待排程</w:t>
+              <w:t>🟢 良好達標 (78%, A-)</w:t>
             </w:r>
           </w:p>
         </w:tc>
@@ -3179,15 +3179,23 @@
     </w:p>
     <w:p>
       <w:r>
-        <w:t>• 當週累積自行車 17.32 km、跑步 12.04 km、游泳 0.00 km，整體時間執行率達 16.1%。</w:t>
+        <w:t>• 當週累積自行車 17.32 km、跑步 12.04 km、游泳 3.45 km，整體時間執行率達 24.6%。</w:t>
         <w:br/>
       </w:r>
       <w:r>
-        <w:t>• Build 1-1 第一建構期旗開得勝：本週正式邁入專項建構期，週二跑步課表扎實吃下 12.04 km (99 分鐘)，單日累積 79 rTSS，專項速度與耐力建構起步極佳！</w:t>
+        <w:t>• Build 1-1 第一建構期旗開得勝：本週正式邁入專項建構期，截至週三已完成游泳 3.45 km (70 分鐘)、單車 17.32 km (35 分鐘)、跑步 12.04 km (99 分鐘)，三項累積 211.0 TSS，專項速度、耐力、流線水感與踩踏節奏建構全面開展！</w:t>
+        <w:br/>
+      </w:r>
+      <w:r>
+        <w:t>• 週三 3,450m 甜甜泳課低心率流暢巡航：9/2 游泳 70 分鐘 (均速 2:02.5/100m, 均心率 114 bpm, sTSS 97.8, 脫鉤率 -20.90% Spd:HR)，在低於乳酸閾值極省力狀態下維持流暢水感與核心流線型，並發揮極佳的下肢動態排酸效果。</w:t>
         <w:br/>
       </w:r>
       <w:r>
         <w:t>• 週二 12.04km 跑步間歇與專項耐力高質量完成：9/1 跑步包含 6 組 400m 速度間歇（配速 3:57~4:09/km、均瓦 369-398W、步頻 183-190 spm、垂直比 6-7% 頂尖經濟性）與接續節奏跑，均心率 147 bpm，脫鉤率 (-9.25% Pw:HR / -6.87% Spd:HR) 展現極佳的心肺穩定度與下肢抗疲勞剛性。</w:t>
+        <w:br/>
+      </w:r>
+      <w:r>
+        <w:t>• 週二 17.32km 單車 TEMPO 8X3 階梯間歇踩踏：9/1 傍晚單車 35 分鐘 (均速 29.35 km/h, 均瓦 137W, 踏頻 82 rpm, 均心 137 bpm, 34.2 TSS)，3 組階梯推進 (171W -&gt; 184W -&gt; 204W 閾值衝刺) 踩踏效率極佳。</w:t>
         <w:br/>
       </w:r>
     </w:p>

</xml_diff>

<commit_message>
Auto Daily 8:00 PM Dashboard Update [2026-09-03 20:00]
</commit_message>
<xml_diff>
--- a/docs/weekly/2026-W36_當週執行率回顧報告.docx
+++ b/docs/weekly/2026-W36_當週執行率回顧報告.docx
@@ -21,7 +21,7 @@
           <w:color w:val="555555"/>
           <w:sz w:val="20"/>
         </w:rPr>
-        <w:t>週期：2026/08/31–2026/09/06　｜　整體時間執行率：24.6%</w:t>
+        <w:t>週期：2026/08/31–2026/09/06　｜　整體時間執行率：37.2%</w:t>
       </w:r>
     </w:p>
     <w:p>
@@ -565,7 +565,7 @@
                 <w:color w:val="000000"/>
                 <w:sz w:val="19"/>
               </w:rPr>
-              <w:t>0.58 hr</w:t>
+              <w:t>1.67 hr</w:t>
             </w:r>
           </w:p>
         </w:tc>
@@ -592,7 +592,7 @@
                 <w:color w:val="000000"/>
                 <w:sz w:val="19"/>
               </w:rPr>
-              <w:t>11.1%</w:t>
+              <w:t>31.7%</w:t>
             </w:r>
           </w:p>
         </w:tc>
@@ -646,7 +646,7 @@
                 <w:color w:val="000000"/>
                 <w:sz w:val="19"/>
               </w:rPr>
-              <w:t>17.32 km</w:t>
+              <w:t>49.42 km</w:t>
             </w:r>
           </w:p>
         </w:tc>
@@ -783,7 +783,7 @@
                 <w:color w:val="000000"/>
                 <w:sz w:val="19"/>
               </w:rPr>
-              <w:t>1.65 hr</w:t>
+              <w:t>2.32 hr</w:t>
             </w:r>
           </w:p>
         </w:tc>
@@ -810,7 +810,7 @@
                 <w:color w:val="000000"/>
                 <w:sz w:val="19"/>
               </w:rPr>
-              <w:t>36.0%</w:t>
+              <w:t>50.5%</w:t>
             </w:r>
           </w:p>
         </w:tc>
@@ -864,7 +864,7 @@
                 <w:color w:val="000000"/>
                 <w:sz w:val="19"/>
               </w:rPr>
-              <w:t>12.04 km</w:t>
+              <w:t>17.00 km</w:t>
             </w:r>
           </w:p>
         </w:tc>
@@ -891,7 +891,7 @@
                 <w:color w:val="000000"/>
                 <w:sz w:val="19"/>
               </w:rPr>
-              <w:t>20.6%</w:t>
+              <w:t>29.1%</w:t>
             </w:r>
           </w:p>
         </w:tc>
@@ -2129,7 +2129,7 @@
                 <w:color w:val="000000"/>
                 <w:sz w:val="19"/>
               </w:rPr>
-              <w:t>0分</w:t>
+              <w:t>65分 / 32.10km</w:t>
             </w:r>
           </w:p>
         </w:tc>
@@ -2156,7 +2156,7 @@
                 <w:color w:val="000000"/>
                 <w:sz w:val="19"/>
               </w:rPr>
-              <w:t>❌ 未執行/待排程</w:t>
+              <w:t>🟠 自覺調整 (72%, B+)</w:t>
             </w:r>
           </w:p>
         </w:tc>
@@ -2295,7 +2295,7 @@
                 <w:color w:val="000000"/>
                 <w:sz w:val="19"/>
               </w:rPr>
-              <w:t>0分</w:t>
+              <w:t>40分 / 4.96km</w:t>
             </w:r>
           </w:p>
         </w:tc>
@@ -2322,7 +2322,7 @@
                 <w:color w:val="000000"/>
                 <w:sz w:val="19"/>
               </w:rPr>
-              <w:t>❌ 未執行/待排程</w:t>
+              <w:t>✅ 精準達標 (100%, A+)</w:t>
             </w:r>
           </w:p>
         </w:tc>
@@ -2546,7 +2546,7 @@
                 <w:color w:val="000000"/>
                 <w:sz w:val="19"/>
               </w:rPr>
-              <w:t>Bike</w:t>
+              <w:t>Bike: Threshold 12x3</w:t>
             </w:r>
           </w:p>
         </w:tc>
@@ -2712,7 +2712,7 @@
                 <w:color w:val="000000"/>
                 <w:sz w:val="19"/>
               </w:rPr>
-              <w:t>Run: 2</w:t>
+              <w:t>Run: 1.5 (15分熱身 / 60分鐘心率150以下 / 15分鐘緩和)</w:t>
             </w:r>
           </w:p>
         </w:tc>
@@ -3179,7 +3179,7 @@
     </w:p>
     <w:p>
       <w:r>
-        <w:t>• 當週累積自行車 17.32 km、跑步 12.04 km、游泳 3.45 km，整體時間執行率達 24.6%。</w:t>
+        <w:t>• 當週累積自行車 49.42 km、跑步 17.00 km、游泳 3.45 km，整體時間執行率達 37.2%。</w:t>
         <w:br/>
       </w:r>
       <w:r>

</xml_diff>

<commit_message>
Auto Daily 8:00 PM Dashboard Update [2026-09-04 20:57]
</commit_message>
<xml_diff>
--- a/docs/weekly/2026-W36_當週執行率回顧報告.docx
+++ b/docs/weekly/2026-W36_當週執行率回顧報告.docx
@@ -21,7 +21,7 @@
           <w:color w:val="555555"/>
           <w:sz w:val="20"/>
         </w:rPr>
-        <w:t>週期：2026/08/31–2026/09/06　｜　整體時間執行率：37.2%</w:t>
+        <w:t>週期：2026/08/31–2026/09/06　｜　整體時間執行率：40.4%</w:t>
       </w:r>
     </w:p>
     <w:p>
@@ -320,7 +320,7 @@
                 <w:color w:val="000000"/>
                 <w:sz w:val="19"/>
               </w:rPr>
-              <w:t>4.00 hr</w:t>
+              <w:t>3.00 hr</w:t>
             </w:r>
           </w:p>
         </w:tc>
@@ -347,7 +347,7 @@
                 <w:color w:val="000000"/>
                 <w:sz w:val="19"/>
               </w:rPr>
-              <w:t>1.17 hr</w:t>
+              <w:t>2.22 hr</w:t>
             </w:r>
           </w:p>
         </w:tc>
@@ -374,7 +374,7 @@
                 <w:color w:val="000000"/>
                 <w:sz w:val="19"/>
               </w:rPr>
-              <w:t>29.2%</w:t>
+              <w:t>73.9%</w:t>
             </w:r>
           </w:p>
         </w:tc>
@@ -401,7 +401,7 @@
                 <w:color w:val="000000"/>
                 <w:sz w:val="19"/>
               </w:rPr>
-              <w:t>3.00 km</w:t>
+              <w:t>0.00 km</w:t>
             </w:r>
           </w:p>
         </w:tc>
@@ -428,7 +428,7 @@
                 <w:color w:val="000000"/>
                 <w:sz w:val="19"/>
               </w:rPr>
-              <w:t>3.45 km</w:t>
+              <w:t>6.60 km</w:t>
             </w:r>
           </w:p>
         </w:tc>
@@ -455,7 +455,7 @@
                 <w:color w:val="000000"/>
                 <w:sz w:val="19"/>
               </w:rPr>
-              <w:t>115.0%</w:t>
+              <w:t>0.0%</w:t>
             </w:r>
           </w:p>
         </w:tc>
@@ -482,7 +482,7 @@
                 <w:color w:val="000000"/>
                 <w:sz w:val="19"/>
               </w:rPr>
-              <w:t>3</w:t>
+              <w:t>2</w:t>
             </w:r>
           </w:p>
         </w:tc>
@@ -538,7 +538,7 @@
                 <w:color w:val="000000"/>
                 <w:sz w:val="19"/>
               </w:rPr>
-              <w:t>5.25 hr</w:t>
+              <w:t>7.75 hr</w:t>
             </w:r>
           </w:p>
         </w:tc>
@@ -592,7 +592,7 @@
                 <w:color w:val="000000"/>
                 <w:sz w:val="19"/>
               </w:rPr>
-              <w:t>31.7%</w:t>
+              <w:t>21.5%</w:t>
             </w:r>
           </w:p>
         </w:tc>
@@ -700,7 +700,7 @@
                 <w:color w:val="000000"/>
                 <w:sz w:val="19"/>
               </w:rPr>
-              <w:t>3</w:t>
+              <w:t>4</w:t>
             </w:r>
           </w:p>
         </w:tc>
@@ -2461,7 +2461,7 @@
                 <w:color w:val="000000"/>
                 <w:sz w:val="19"/>
               </w:rPr>
-              <w:t>0分</w:t>
+              <w:t>63分 / 3.15km</w:t>
             </w:r>
           </w:p>
         </w:tc>
@@ -2488,7 +2488,7 @@
                 <w:color w:val="000000"/>
                 <w:sz w:val="19"/>
               </w:rPr>
-              <w:t>❌ 未執行/待排程</w:t>
+              <w:t>🟠 自覺調整 (70%, B+)</w:t>
             </w:r>
           </w:p>
         </w:tc>
@@ -2878,7 +2878,173 @@
                 <w:color w:val="000000"/>
                 <w:sz w:val="19"/>
               </w:rPr>
-              <w:t>Run: 2小時 河濱</w:t>
+              <w:t>Bike: Endurance</w:t>
+            </w:r>
+          </w:p>
+        </w:tc>
+        <w:tc>
+          <w:tcPr>
+            <w:tcW w:type="dxa" w:w="1050"/>
+            <w:tcMar>
+              <w:top w:w="80" w:type="dxa"/>
+              <w:start w:w="120" w:type="dxa"/>
+              <w:bottom w:w="80" w:type="dxa"/>
+              <w:end w:w="120" w:type="dxa"/>
+            </w:tcMar>
+            <w:vAlign w:val="center"/>
+          </w:tcPr>
+          <w:p>
+            <w:pPr>
+              <w:spacing w:after="0"/>
+              <w:jc w:val="center"/>
+            </w:pPr>
+            <w:r>
+              <w:rPr>
+                <w:rFonts w:ascii="Calibri" w:hAnsi="Calibri" w:eastAsia="Microsoft JhengHei"/>
+                <w:b w:val="0"/>
+                <w:color w:val="000000"/>
+                <w:sz w:val="19"/>
+              </w:rPr>
+              <w:t>Bike</w:t>
+            </w:r>
+          </w:p>
+        </w:tc>
+        <w:tc>
+          <w:tcPr>
+            <w:tcW w:type="dxa" w:w="1500"/>
+            <w:tcMar>
+              <w:top w:w="80" w:type="dxa"/>
+              <w:start w:w="120" w:type="dxa"/>
+              <w:bottom w:w="80" w:type="dxa"/>
+              <w:end w:w="120" w:type="dxa"/>
+            </w:tcMar>
+            <w:vAlign w:val="center"/>
+          </w:tcPr>
+          <w:p>
+            <w:pPr>
+              <w:spacing w:after="0"/>
+              <w:jc w:val="center"/>
+            </w:pPr>
+            <w:r>
+              <w:rPr>
+                <w:rFonts w:ascii="Calibri" w:hAnsi="Calibri" w:eastAsia="Microsoft JhengHei"/>
+                <w:b w:val="0"/>
+                <w:color w:val="000000"/>
+                <w:sz w:val="19"/>
+              </w:rPr>
+              <w:t>150分</w:t>
+            </w:r>
+          </w:p>
+        </w:tc>
+        <w:tc>
+          <w:tcPr>
+            <w:tcW w:type="dxa" w:w="1500"/>
+            <w:tcMar>
+              <w:top w:w="80" w:type="dxa"/>
+              <w:start w:w="120" w:type="dxa"/>
+              <w:bottom w:w="80" w:type="dxa"/>
+              <w:end w:w="120" w:type="dxa"/>
+            </w:tcMar>
+            <w:vAlign w:val="center"/>
+          </w:tcPr>
+          <w:p>
+            <w:pPr>
+              <w:spacing w:after="0"/>
+              <w:jc w:val="center"/>
+            </w:pPr>
+            <w:r>
+              <w:rPr>
+                <w:rFonts w:ascii="Calibri" w:hAnsi="Calibri" w:eastAsia="Microsoft JhengHei"/>
+                <w:b w:val="0"/>
+                <w:color w:val="000000"/>
+                <w:sz w:val="19"/>
+              </w:rPr>
+              <w:t>0分</w:t>
+            </w:r>
+          </w:p>
+        </w:tc>
+        <w:tc>
+          <w:tcPr>
+            <w:tcW w:type="dxa" w:w="1810"/>
+            <w:tcMar>
+              <w:top w:w="80" w:type="dxa"/>
+              <w:start w:w="120" w:type="dxa"/>
+              <w:bottom w:w="80" w:type="dxa"/>
+              <w:end w:w="120" w:type="dxa"/>
+            </w:tcMar>
+            <w:vAlign w:val="center"/>
+          </w:tcPr>
+          <w:p>
+            <w:pPr>
+              <w:spacing w:after="0"/>
+              <w:jc w:val="center"/>
+            </w:pPr>
+            <w:r>
+              <w:rPr>
+                <w:rFonts w:ascii="Calibri" w:hAnsi="Calibri" w:eastAsia="Microsoft JhengHei"/>
+                <w:b w:val="0"/>
+                <w:color w:val="000000"/>
+                <w:sz w:val="19"/>
+              </w:rPr>
+              <w:t>❌ 未執行/待排程</w:t>
+            </w:r>
+          </w:p>
+        </w:tc>
+      </w:tr>
+      <w:tr>
+        <w:tc>
+          <w:tcPr>
+            <w:tcW w:type="dxa" w:w="1050"/>
+            <w:tcMar>
+              <w:top w:w="80" w:type="dxa"/>
+              <w:start w:w="120" w:type="dxa"/>
+              <w:bottom w:w="80" w:type="dxa"/>
+              <w:end w:w="120" w:type="dxa"/>
+            </w:tcMar>
+            <w:vAlign w:val="center"/>
+          </w:tcPr>
+          <w:p>
+            <w:pPr>
+              <w:spacing w:after="0"/>
+              <w:jc w:val="center"/>
+            </w:pPr>
+            <w:r>
+              <w:rPr>
+                <w:rFonts w:ascii="Calibri" w:hAnsi="Calibri" w:eastAsia="Microsoft JhengHei"/>
+                <w:b w:val="0"/>
+                <w:color w:val="000000"/>
+                <w:sz w:val="19"/>
+              </w:rPr>
+              <w:t>09/06</w:t>
+              <w:br/>
+              <w:t>週日</w:t>
+            </w:r>
+          </w:p>
+        </w:tc>
+        <w:tc>
+          <w:tcPr>
+            <w:tcW w:type="dxa" w:w="2750"/>
+            <w:tcMar>
+              <w:top w:w="80" w:type="dxa"/>
+              <w:start w:w="120" w:type="dxa"/>
+              <w:bottom w:w="80" w:type="dxa"/>
+              <w:end w:w="120" w:type="dxa"/>
+            </w:tcMar>
+            <w:vAlign w:val="center"/>
+          </w:tcPr>
+          <w:p>
+            <w:pPr>
+              <w:spacing w:after="0"/>
+              <w:jc w:val="left"/>
+            </w:pPr>
+            <w:r>
+              <w:rPr>
+                <w:rFonts w:ascii="Calibri" w:hAnsi="Calibri" w:eastAsia="Microsoft JhengHei"/>
+                <w:b w:val="0"/>
+                <w:color w:val="000000"/>
+                <w:sz w:val="19"/>
+              </w:rPr>
+              <w:t>Run: Easy 1.5 小時</w:t>
             </w:r>
           </w:p>
         </w:tc>
@@ -2991,172 +3157,6 @@
           </w:p>
         </w:tc>
       </w:tr>
-      <w:tr>
-        <w:tc>
-          <w:tcPr>
-            <w:tcW w:type="dxa" w:w="1050"/>
-            <w:tcMar>
-              <w:top w:w="80" w:type="dxa"/>
-              <w:start w:w="120" w:type="dxa"/>
-              <w:bottom w:w="80" w:type="dxa"/>
-              <w:end w:w="120" w:type="dxa"/>
-            </w:tcMar>
-            <w:vAlign w:val="center"/>
-          </w:tcPr>
-          <w:p>
-            <w:pPr>
-              <w:spacing w:after="0"/>
-              <w:jc w:val="center"/>
-            </w:pPr>
-            <w:r>
-              <w:rPr>
-                <w:rFonts w:ascii="Calibri" w:hAnsi="Calibri" w:eastAsia="Microsoft JhengHei"/>
-                <w:b w:val="0"/>
-                <w:color w:val="000000"/>
-                <w:sz w:val="19"/>
-              </w:rPr>
-              <w:t>09/06</w:t>
-              <w:br/>
-              <w:t>週日</w:t>
-            </w:r>
-          </w:p>
-        </w:tc>
-        <w:tc>
-          <w:tcPr>
-            <w:tcW w:type="dxa" w:w="2750"/>
-            <w:tcMar>
-              <w:top w:w="80" w:type="dxa"/>
-              <w:start w:w="120" w:type="dxa"/>
-              <w:bottom w:w="80" w:type="dxa"/>
-              <w:end w:w="120" w:type="dxa"/>
-            </w:tcMar>
-            <w:vAlign w:val="center"/>
-          </w:tcPr>
-          <w:p>
-            <w:pPr>
-              <w:spacing w:after="0"/>
-              <w:jc w:val="left"/>
-            </w:pPr>
-            <w:r>
-              <w:rPr>
-                <w:rFonts w:ascii="Calibri" w:hAnsi="Calibri" w:eastAsia="Microsoft JhengHei"/>
-                <w:b w:val="0"/>
-                <w:color w:val="000000"/>
-                <w:sz w:val="19"/>
-              </w:rPr>
-              <w:t>Swim: 3000</w:t>
-            </w:r>
-          </w:p>
-        </w:tc>
-        <w:tc>
-          <w:tcPr>
-            <w:tcW w:type="dxa" w:w="1050"/>
-            <w:tcMar>
-              <w:top w:w="80" w:type="dxa"/>
-              <w:start w:w="120" w:type="dxa"/>
-              <w:bottom w:w="80" w:type="dxa"/>
-              <w:end w:w="120" w:type="dxa"/>
-            </w:tcMar>
-            <w:vAlign w:val="center"/>
-          </w:tcPr>
-          <w:p>
-            <w:pPr>
-              <w:spacing w:after="0"/>
-              <w:jc w:val="center"/>
-            </w:pPr>
-            <w:r>
-              <w:rPr>
-                <w:rFonts w:ascii="Calibri" w:hAnsi="Calibri" w:eastAsia="Microsoft JhengHei"/>
-                <w:b w:val="0"/>
-                <w:color w:val="000000"/>
-                <w:sz w:val="19"/>
-              </w:rPr>
-              <w:t>Swim</w:t>
-            </w:r>
-          </w:p>
-        </w:tc>
-        <w:tc>
-          <w:tcPr>
-            <w:tcW w:type="dxa" w:w="1500"/>
-            <w:tcMar>
-              <w:top w:w="80" w:type="dxa"/>
-              <w:start w:w="120" w:type="dxa"/>
-              <w:bottom w:w="80" w:type="dxa"/>
-              <w:end w:w="120" w:type="dxa"/>
-            </w:tcMar>
-            <w:vAlign w:val="center"/>
-          </w:tcPr>
-          <w:p>
-            <w:pPr>
-              <w:spacing w:after="0"/>
-              <w:jc w:val="center"/>
-            </w:pPr>
-            <w:r>
-              <w:rPr>
-                <w:rFonts w:ascii="Calibri" w:hAnsi="Calibri" w:eastAsia="Microsoft JhengHei"/>
-                <w:b w:val="0"/>
-                <w:color w:val="000000"/>
-                <w:sz w:val="19"/>
-              </w:rPr>
-              <w:t>60分 / 3.00km</w:t>
-            </w:r>
-          </w:p>
-        </w:tc>
-        <w:tc>
-          <w:tcPr>
-            <w:tcW w:type="dxa" w:w="1500"/>
-            <w:tcMar>
-              <w:top w:w="80" w:type="dxa"/>
-              <w:start w:w="120" w:type="dxa"/>
-              <w:bottom w:w="80" w:type="dxa"/>
-              <w:end w:w="120" w:type="dxa"/>
-            </w:tcMar>
-            <w:vAlign w:val="center"/>
-          </w:tcPr>
-          <w:p>
-            <w:pPr>
-              <w:spacing w:after="0"/>
-              <w:jc w:val="center"/>
-            </w:pPr>
-            <w:r>
-              <w:rPr>
-                <w:rFonts w:ascii="Calibri" w:hAnsi="Calibri" w:eastAsia="Microsoft JhengHei"/>
-                <w:b w:val="0"/>
-                <w:color w:val="000000"/>
-                <w:sz w:val="19"/>
-              </w:rPr>
-              <w:t>0分</w:t>
-            </w:r>
-          </w:p>
-        </w:tc>
-        <w:tc>
-          <w:tcPr>
-            <w:tcW w:type="dxa" w:w="1810"/>
-            <w:tcMar>
-              <w:top w:w="80" w:type="dxa"/>
-              <w:start w:w="120" w:type="dxa"/>
-              <w:bottom w:w="80" w:type="dxa"/>
-              <w:end w:w="120" w:type="dxa"/>
-            </w:tcMar>
-            <w:vAlign w:val="center"/>
-          </w:tcPr>
-          <w:p>
-            <w:pPr>
-              <w:spacing w:after="0"/>
-              <w:jc w:val="center"/>
-            </w:pPr>
-            <w:r>
-              <w:rPr>
-                <w:rFonts w:ascii="Calibri" w:hAnsi="Calibri" w:eastAsia="Microsoft JhengHei"/>
-                <w:b w:val="0"/>
-                <w:color w:val="000000"/>
-                <w:sz w:val="19"/>
-              </w:rPr>
-              <w:t>❌ 未執行/待排程</w:t>
-            </w:r>
-          </w:p>
-        </w:tc>
-      </w:tr>
     </w:tbl>
     <w:p>
       <w:pPr>
@@ -3179,7 +3179,7 @@
     </w:p>
     <w:p>
       <w:r>
-        <w:t>• 當週累積自行車 49.42 km、跑步 17.00 km、游泳 3.45 km，整體時間執行率達 37.2%。</w:t>
+        <w:t>• 當週累積自行車 49.42 km、跑步 17.00 km、游泳 6.60 km，整體時間執行率達 40.4%。</w:t>
         <w:br/>
       </w:r>
       <w:r>

</xml_diff>

<commit_message>
Auto Daily Dashboard Update: Sync 2026-09-05 Brick Workout (Bike 70.31km + Run 11.74km)
</commit_message>
<xml_diff>
--- a/docs/weekly/2026-W36_當週執行率回顧報告.docx
+++ b/docs/weekly/2026-W36_當週執行率回顧報告.docx
@@ -21,7 +21,7 @@
           <w:color w:val="555555"/>
           <w:sz w:val="20"/>
         </w:rPr>
-        <w:t>週期：2026/08/31–2026/09/06　｜　整體時間執行率：40.4%</w:t>
+        <w:t>週期：2026/08/31–2026/09/06　｜　整體時間執行率：67.0%</w:t>
       </w:r>
     </w:p>
     <w:p>
@@ -565,7 +565,7 @@
                 <w:color w:val="000000"/>
                 <w:sz w:val="19"/>
               </w:rPr>
-              <w:t>1.67 hr</w:t>
+              <w:t>4.23 hr</w:t>
             </w:r>
           </w:p>
         </w:tc>
@@ -592,7 +592,7 @@
                 <w:color w:val="000000"/>
                 <w:sz w:val="19"/>
               </w:rPr>
-              <w:t>21.5%</w:t>
+              <w:t>54.6%</w:t>
             </w:r>
           </w:p>
         </w:tc>
@@ -646,7 +646,7 @@
                 <w:color w:val="000000"/>
                 <w:sz w:val="19"/>
               </w:rPr>
-              <w:t>49.42 km</w:t>
+              <w:t>119.73 km</w:t>
             </w:r>
           </w:p>
         </w:tc>
@@ -783,7 +783,7 @@
                 <w:color w:val="000000"/>
                 <w:sz w:val="19"/>
               </w:rPr>
-              <w:t>2.32 hr</w:t>
+              <w:t>3.82 hr</w:t>
             </w:r>
           </w:p>
         </w:tc>
@@ -810,7 +810,7 @@
                 <w:color w:val="000000"/>
                 <w:sz w:val="19"/>
               </w:rPr>
-              <w:t>50.5%</w:t>
+              <w:t>83.3%</w:t>
             </w:r>
           </w:p>
         </w:tc>
@@ -864,7 +864,7 @@
                 <w:color w:val="000000"/>
                 <w:sz w:val="19"/>
               </w:rPr>
-              <w:t>17.00 km</w:t>
+              <w:t>28.74 km</w:t>
             </w:r>
           </w:p>
         </w:tc>
@@ -891,7 +891,7 @@
                 <w:color w:val="000000"/>
                 <w:sz w:val="19"/>
               </w:rPr>
-              <w:t>29.1%</w:t>
+              <w:t>49.2%</w:t>
             </w:r>
           </w:p>
         </w:tc>
@@ -2627,7 +2627,7 @@
                 <w:color w:val="000000"/>
                 <w:sz w:val="19"/>
               </w:rPr>
-              <w:t>0分</w:t>
+              <w:t>154分 / 70.31km</w:t>
             </w:r>
           </w:p>
         </w:tc>
@@ -2654,7 +2654,7 @@
                 <w:color w:val="000000"/>
                 <w:sz w:val="19"/>
               </w:rPr>
-              <w:t>❌ 未執行/待排程</w:t>
+              <w:t>🟢 良好達標 (86%, A-)</w:t>
             </w:r>
           </w:p>
         </w:tc>
@@ -2793,7 +2793,7 @@
                 <w:color w:val="000000"/>
                 <w:sz w:val="19"/>
               </w:rPr>
-              <w:t>0分</w:t>
+              <w:t>90分 / 11.74km</w:t>
             </w:r>
           </w:p>
         </w:tc>
@@ -2820,7 +2820,7 @@
                 <w:color w:val="000000"/>
                 <w:sz w:val="19"/>
               </w:rPr>
-              <w:t>❌ 未執行/待排程</w:t>
+              <w:t>🟢 良好達標 (75%, A-)</w:t>
             </w:r>
           </w:p>
         </w:tc>
@@ -3179,11 +3179,19 @@
     </w:p>
     <w:p>
       <w:r>
-        <w:t>• 當週累積自行車 49.42 km、跑步 17.00 km、游泳 6.60 km，整體時間執行率達 40.4%。</w:t>
+        <w:t>• 當週累積自行車 119.73 km、跑步 28.74 km、游泳 6.60 km，整體時間執行率達 67.0%。</w:t>
         <w:br/>
       </w:r>
       <w:r>
-        <w:t>• Build 1-1 第一建構期旗開得勝：本週正式邁入專項建構期，截至週三已完成游泳 3.45 km (70 分鐘)、單車 17.32 km (35 分鐘)、跑步 12.04 km (99 分鐘)，三項累積 211.0 TSS，專項速度、耐力、流線水感與踩踏節奏建構全面開展！</w:t>
+        <w:t>• Build 1-1 第一建構期旗開得勝：本週正式邁入專項建構期，截至週六已完成自行車 119.73 km、跑步 28.74 km、游泳 6.60 km，三項累積總時長突破 10 小時 15 分，專項速度、閾值衝擊、轉換適應與流線水感全面開展！</w:t>
+        <w:br/>
+      </w:r>
+      <w:r>
+        <w:t>• 週六單車 Threshold 12x3 (70.31km) ＋ 轉換跑 1.5h (11.74km) 頂尖雙課表：9/5 單車 2h35m (NP 157W, 151.4 TSS, 均心 145 bpm, 均踏頻 86 rpm)，精準執行 3 組 95-105% FTP 閾值衝刺；下車後僅 7 分鐘無縫換鞋接續 90 分鐘長跑，嚴格遵循心率 150 bpm 以下紀律 (均心 145 bpm, 46.1 rTSS)，單日轉換合繳 197.5 TSS、82.05 km，極佳模擬 226 後段轉向抗疲勞能力！</w:t>
+        <w:br/>
+      </w:r>
+      <w:r>
+        <w:t>• 週四單車 TEMPO 2x20 (32.10km) ＋ 轉換跑 4.96km：9/3 順利吃下 65 分鐘單車 (均速 29.63 km/h) ＋ 40 分鐘轉換跑 (步頻 172 spm)，轉換神經肌肉適應極佳。</w:t>
         <w:br/>
       </w:r>
       <w:r>
@@ -3191,11 +3199,7 @@
         <w:br/>
       </w:r>
       <w:r>
-        <w:t>• 週二 12.04km 跑步間歇與專項耐力高質量完成：9/1 跑步包含 6 組 400m 速度間歇（配速 3:57~4:09/km、均瓦 369-398W、步頻 183-190 spm、垂直比 6-7% 頂尖經濟性）與接續節奏跑，均心率 147 bpm，脫鉤率 (-9.25% Pw:HR / -6.87% Spd:HR) 展現極佳的心肺穩定度與下肢抗疲勞剛性。</w:t>
-        <w:br/>
-      </w:r>
-      <w:r>
-        <w:t>• 週二 17.32km 單車 TEMPO 8X3 階梯間歇踩踏：9/1 傍晚單車 35 分鐘 (均速 29.35 km/h, 均瓦 137W, 踏頻 82 rpm, 均心 137 bpm, 34.2 TSS)，3 組階梯推進 (171W -&gt; 184W -&gt; 204W 閾值衝刺) 踩踏效率極佳。</w:t>
+        <w:t>• 週二 12.04km 跑步間歇與 17.32km 單車階梯間歇：9/1 跑步包含 6 組 400m 速度間歇（配速 3:57~4:09/km、均瓦 369-398W）與單車 3 組階梯推進 (171W -&gt; 184W -&gt; 204W 閾值衝刺)。</w:t>
         <w:br/>
       </w:r>
     </w:p>

</xml_diff>

<commit_message>
Auto Daily Dashboard Update: Sync 2026-09-06 Workouts (Bike 66.02km + Swim 3.45km) and finalize W36 execution report
</commit_message>
<xml_diff>
--- a/docs/weekly/2026-W36_當週執行率回顧報告.docx
+++ b/docs/weekly/2026-W36_當週執行率回顧報告.docx
@@ -21,7 +21,7 @@
           <w:color w:val="555555"/>
           <w:sz w:val="20"/>
         </w:rPr>
-        <w:t>週期：2026/08/31–2026/09/06　｜　整體時間執行率：67.0%</w:t>
+        <w:t>週期：2026/08/31–2026/09/06　｜　整體時間執行率：91.0%</w:t>
       </w:r>
     </w:p>
     <w:p>
@@ -347,7 +347,7 @@
                 <w:color w:val="000000"/>
                 <w:sz w:val="19"/>
               </w:rPr>
-              <w:t>2.22 hr</w:t>
+              <w:t>3.40 hr</w:t>
             </w:r>
           </w:p>
         </w:tc>
@@ -374,7 +374,7 @@
                 <w:color w:val="000000"/>
                 <w:sz w:val="19"/>
               </w:rPr>
-              <w:t>73.9%</w:t>
+              <w:t>113.3%</w:t>
             </w:r>
           </w:p>
         </w:tc>
@@ -428,7 +428,7 @@
                 <w:color w:val="000000"/>
                 <w:sz w:val="19"/>
               </w:rPr>
-              <w:t>6.60 km</w:t>
+              <w:t>10.05 km</w:t>
             </w:r>
           </w:p>
         </w:tc>
@@ -482,7 +482,7 @@
                 <w:color w:val="000000"/>
                 <w:sz w:val="19"/>
               </w:rPr>
-              <w:t>2</w:t>
+              <w:t>3</w:t>
             </w:r>
           </w:p>
         </w:tc>
@@ -565,7 +565,7 @@
                 <w:color w:val="000000"/>
                 <w:sz w:val="19"/>
               </w:rPr>
-              <w:t>4.23 hr</w:t>
+              <w:t>6.73 hr</w:t>
             </w:r>
           </w:p>
         </w:tc>
@@ -592,7 +592,7 @@
                 <w:color w:val="000000"/>
                 <w:sz w:val="19"/>
               </w:rPr>
-              <w:t>54.6%</w:t>
+              <w:t>86.9%</w:t>
             </w:r>
           </w:p>
         </w:tc>
@@ -646,7 +646,7 @@
                 <w:color w:val="000000"/>
                 <w:sz w:val="19"/>
               </w:rPr>
-              <w:t>119.73 km</w:t>
+              <w:t>185.75 km</w:t>
             </w:r>
           </w:p>
         </w:tc>
@@ -2959,7 +2959,7 @@
                 <w:color w:val="000000"/>
                 <w:sz w:val="19"/>
               </w:rPr>
-              <w:t>0分</w:t>
+              <w:t>150分 / 66.02km</w:t>
             </w:r>
           </w:p>
         </w:tc>
@@ -2986,7 +2986,7 @@
                 <w:color w:val="000000"/>
                 <w:sz w:val="19"/>
               </w:rPr>
-              <w:t>❌ 未執行/待排程</w:t>
+              <w:t>✅ 精準達標 (100%, A+)</w:t>
             </w:r>
           </w:p>
         </w:tc>
@@ -3157,6 +3157,172 @@
           </w:p>
         </w:tc>
       </w:tr>
+      <w:tr>
+        <w:tc>
+          <w:tcPr>
+            <w:tcW w:type="dxa" w:w="1050"/>
+            <w:tcMar>
+              <w:top w:w="80" w:type="dxa"/>
+              <w:start w:w="120" w:type="dxa"/>
+              <w:bottom w:w="80" w:type="dxa"/>
+              <w:end w:w="120" w:type="dxa"/>
+            </w:tcMar>
+            <w:vAlign w:val="center"/>
+          </w:tcPr>
+          <w:p>
+            <w:pPr>
+              <w:spacing w:after="0"/>
+              <w:jc w:val="center"/>
+            </w:pPr>
+            <w:r>
+              <w:rPr>
+                <w:rFonts w:ascii="Calibri" w:hAnsi="Calibri" w:eastAsia="Microsoft JhengHei"/>
+                <w:b w:val="0"/>
+                <w:color w:val="000000"/>
+                <w:sz w:val="19"/>
+              </w:rPr>
+              <w:t>09/06</w:t>
+              <w:br/>
+              <w:t>週日</w:t>
+            </w:r>
+          </w:p>
+        </w:tc>
+        <w:tc>
+          <w:tcPr>
+            <w:tcW w:type="dxa" w:w="2750"/>
+            <w:tcMar>
+              <w:top w:w="80" w:type="dxa"/>
+              <w:start w:w="120" w:type="dxa"/>
+              <w:bottom w:w="80" w:type="dxa"/>
+              <w:end w:w="120" w:type="dxa"/>
+            </w:tcMar>
+            <w:vAlign w:val="center"/>
+          </w:tcPr>
+          <w:p>
+            <w:pPr>
+              <w:spacing w:after="0"/>
+              <w:jc w:val="left"/>
+            </w:pPr>
+            <w:r>
+              <w:rPr>
+                <w:rFonts w:ascii="Calibri" w:hAnsi="Calibri" w:eastAsia="Microsoft JhengHei"/>
+                <w:b w:val="0"/>
+                <w:color w:val="000000"/>
+                <w:sz w:val="19"/>
+              </w:rPr>
+              <w:t>Swim: Lap Swimming</w:t>
+            </w:r>
+          </w:p>
+        </w:tc>
+        <w:tc>
+          <w:tcPr>
+            <w:tcW w:type="dxa" w:w="1050"/>
+            <w:tcMar>
+              <w:top w:w="80" w:type="dxa"/>
+              <w:start w:w="120" w:type="dxa"/>
+              <w:bottom w:w="80" w:type="dxa"/>
+              <w:end w:w="120" w:type="dxa"/>
+            </w:tcMar>
+            <w:vAlign w:val="center"/>
+          </w:tcPr>
+          <w:p>
+            <w:pPr>
+              <w:spacing w:after="0"/>
+              <w:jc w:val="center"/>
+            </w:pPr>
+            <w:r>
+              <w:rPr>
+                <w:rFonts w:ascii="Calibri" w:hAnsi="Calibri" w:eastAsia="Microsoft JhengHei"/>
+                <w:b w:val="0"/>
+                <w:color w:val="000000"/>
+                <w:sz w:val="19"/>
+              </w:rPr>
+              <w:t>Swim</w:t>
+            </w:r>
+          </w:p>
+        </w:tc>
+        <w:tc>
+          <w:tcPr>
+            <w:tcW w:type="dxa" w:w="1500"/>
+            <w:tcMar>
+              <w:top w:w="80" w:type="dxa"/>
+              <w:start w:w="120" w:type="dxa"/>
+              <w:bottom w:w="80" w:type="dxa"/>
+              <w:end w:w="120" w:type="dxa"/>
+            </w:tcMar>
+            <w:vAlign w:val="center"/>
+          </w:tcPr>
+          <w:p>
+            <w:pPr>
+              <w:spacing w:after="0"/>
+              <w:jc w:val="center"/>
+            </w:pPr>
+            <w:r>
+              <w:rPr>
+                <w:rFonts w:ascii="Calibri" w:hAnsi="Calibri" w:eastAsia="Microsoft JhengHei"/>
+                <w:b w:val="0"/>
+                <w:color w:val="000000"/>
+                <w:sz w:val="19"/>
+              </w:rPr>
+              <w:t>0分</w:t>
+            </w:r>
+          </w:p>
+        </w:tc>
+        <w:tc>
+          <w:tcPr>
+            <w:tcW w:type="dxa" w:w="1500"/>
+            <w:tcMar>
+              <w:top w:w="80" w:type="dxa"/>
+              <w:start w:w="120" w:type="dxa"/>
+              <w:bottom w:w="80" w:type="dxa"/>
+              <w:end w:w="120" w:type="dxa"/>
+            </w:tcMar>
+            <w:vAlign w:val="center"/>
+          </w:tcPr>
+          <w:p>
+            <w:pPr>
+              <w:spacing w:after="0"/>
+              <w:jc w:val="center"/>
+            </w:pPr>
+            <w:r>
+              <w:rPr>
+                <w:rFonts w:ascii="Calibri" w:hAnsi="Calibri" w:eastAsia="Microsoft JhengHei"/>
+                <w:b w:val="0"/>
+                <w:color w:val="000000"/>
+                <w:sz w:val="19"/>
+              </w:rPr>
+              <w:t>71分 / 3.45km</w:t>
+            </w:r>
+          </w:p>
+        </w:tc>
+        <w:tc>
+          <w:tcPr>
+            <w:tcW w:type="dxa" w:w="1810"/>
+            <w:tcMar>
+              <w:top w:w="80" w:type="dxa"/>
+              <w:start w:w="120" w:type="dxa"/>
+              <w:bottom w:w="80" w:type="dxa"/>
+              <w:end w:w="120" w:type="dxa"/>
+            </w:tcMar>
+            <w:vAlign w:val="center"/>
+          </w:tcPr>
+          <w:p>
+            <w:pPr>
+              <w:spacing w:after="0"/>
+              <w:jc w:val="center"/>
+            </w:pPr>
+            <w:r>
+              <w:rPr>
+                <w:rFonts w:ascii="Calibri" w:hAnsi="Calibri" w:eastAsia="Microsoft JhengHei"/>
+                <w:b w:val="0"/>
+                <w:color w:val="000000"/>
+                <w:sz w:val="19"/>
+              </w:rPr>
+              <w:t>✨ 動態排酸 (A)</w:t>
+            </w:r>
+          </w:p>
+        </w:tc>
+      </w:tr>
     </w:tbl>
     <w:p>
       <w:pPr>
@@ -3179,11 +3345,15 @@
     </w:p>
     <w:p>
       <w:r>
-        <w:t>• 當週累積自行車 119.73 km、跑步 28.74 km、游泳 6.60 km，整體時間執行率達 67.0%。</w:t>
+        <w:t>• 當週累積自行車 185.75 km、跑步 28.74 km、游泳 10.05 km，整體時間執行率達 91.0%。</w:t>
         <w:br/>
       </w:r>
       <w:r>
-        <w:t>• Build 1-1 第一建構期旗開得勝：本週正式邁入專項建構期，截至週六已完成自行車 119.73 km、跑步 28.74 km、游泳 6.60 km，三項累積總時長突破 10 小時 15 分，專項速度、閾值衝擊、轉換適應與流線水感全面開展！</w:t>
+        <w:t>• Build 1-1 第一建構期旗開得勝・全週圓滿高質量結算：本週正式邁入專項建構期，全週圓滿完成自行車 185.75 km、跑步 28.74 km、游泳 10.05 km，三項累積總時長達 13.95 小時 (整體時間執行率 91.0%)，總 TSS 突破 800+，專項耐力、閾值衝擊、轉換適應與長距離水感全面大躍升！</w:t>
+        <w:br/>
+      </w:r>
+      <w:r>
+        <w:t>• 週日單車 Endurance 2.5 (66.02km) ＋ 長游 3,450m 高質量雙課表：9/6 單車 2h31m (107.1 TSS, 均速 26.28 km/h) 穩健 Zone 2 巡航並落實補給演練；隨後接續 3,450m 長游 (1h12m, 93.9 sTSS, 均速 2:04.5/100m)，單日累積 69.47 km、201.0 TSS，週游量正式跨越 10 公里大關 (10.05 km)！</w:t>
         <w:br/>
       </w:r>
       <w:r>
@@ -3195,7 +3365,7 @@
         <w:br/>
       </w:r>
       <w:r>
-        <w:t>• 週三 3,450m 甜甜泳課低心率流暢巡航：9/2 游泳 70 分鐘 (均速 2:02.5/100m, 均心率 114 bpm, sTSS 97.8, 脫鉤率 -20.90% Spd:HR)，在低於乳酸閾值極省力狀態下維持流暢水感與核心流線型，並發揮極佳的下肢動態排酸效果。</w:t>
+        <w:t>• 週三與週五 雙長池甜甜泳課 (合計 6,600m)：9/2 游泳 70 分鐘 (均速 2:02.5/100m, 均心率 114 bpm, sTSS 97.8, 脫鉤率 -20.90% Spd:HR)；9/4 游泳 63 分鐘游出 3,150m，在低於乳酸閾值極省力狀態下維持流暢水感與核心流線型。</w:t>
         <w:br/>
       </w:r>
       <w:r>

</xml_diff>